<commit_message>
Correção do fluxo principal e seção Incluir pedido CSU 03 - Manter pedido. Close #93
</commit_message>
<xml_diff>
--- a/Requisitos/CSU03 - Manter pedido.docx
+++ b/Requisitos/CSU03 - Manter pedido.docx
@@ -1,6 +1,6 @@
 
 <file path=word/document.xml><?xml version="1.0" encoding="utf-8"?>
-<w:document xmlns:wpc="http://schemas.microsoft.com/office/word/2010/wordprocessingCanvas" xmlns:cx="http://schemas.microsoft.com/office/drawing/2014/chartex" xmlns:cx1="http://schemas.microsoft.com/office/drawing/2015/9/8/chartex" xmlns:cx2="http://schemas.microsoft.com/office/drawing/2015/10/21/chartex" xmlns:cx3="http://schemas.microsoft.com/office/drawing/2016/5/9/chartex" xmlns:cx4="http://schemas.microsoft.com/office/drawing/2016/5/10/chartex" xmlns:cx5="http://schemas.microsoft.com/office/drawing/2016/5/11/chartex" xmlns:cx6="http://schemas.microsoft.com/office/drawing/2016/5/12/chartex" xmlns:cx7="http://schemas.microsoft.com/office/drawing/2016/5/13/chartex" xmlns:cx8="http://schemas.microsoft.com/office/drawing/2016/5/14/chartex" xmlns:mc="http://schemas.openxmlformats.org/markup-compatibility/2006" xmlns:aink="http://schemas.microsoft.com/office/drawing/2016/ink" xmlns:am3d="http://schemas.microsoft.com/office/drawing/2017/model3d" xmlns:o="urn:schemas-microsoft-com:office:office" xmlns:oel="http://schemas.microsoft.com/office/2019/extlst" xmlns:r="http://schemas.openxmlformats.org/officeDocument/2006/relationships" xmlns:m="http://schemas.openxmlformats.org/officeDocument/2006/math" xmlns:v="urn:schemas-microsoft-com:vml" xmlns:wp14="http://schemas.microsoft.com/office/word/2010/wordprocessingDrawing" xmlns:wp="http://schemas.openxmlformats.org/drawingml/2006/wordprocessingDrawing" xmlns:w10="urn:schemas-microsoft-com:office:word" xmlns:w="http://schemas.openxmlformats.org/wordprocessingml/2006/main" xmlns:w14="http://schemas.microsoft.com/office/word/2010/wordml" xmlns:w15="http://schemas.microsoft.com/office/word/2012/wordml" xmlns:w16cex="http://schemas.microsoft.com/office/word/2018/wordml/cex" xmlns:w16cid="http://schemas.microsoft.com/office/word/2016/wordml/cid" xmlns:w16="http://schemas.microsoft.com/office/word/2018/wordml" xmlns:w16du="http://schemas.microsoft.com/office/word/2023/wordml/word16du" xmlns:w16sdtdh="http://schemas.microsoft.com/office/word/2020/wordml/sdtdatahash" xmlns:w16se="http://schemas.microsoft.com/office/word/2015/wordml/symex" xmlns:wpg="http://schemas.microsoft.com/office/word/2010/wordprocessingGroup" xmlns:wpi="http://schemas.microsoft.com/office/word/2010/wordprocessingInk" xmlns:wne="http://schemas.microsoft.com/office/word/2006/wordml" xmlns:wps="http://schemas.microsoft.com/office/word/2010/wordprocessingShape" mc:Ignorable="w14 w15 w16se w16cid w16 w16cex w16sdtdh w16du wp14">
+<w:document xmlns:wpc="http://schemas.microsoft.com/office/word/2010/wordprocessingCanvas" xmlns:cx="http://schemas.microsoft.com/office/drawing/2014/chartex" xmlns:mc="http://schemas.openxmlformats.org/markup-compatibility/2006" xmlns:o="urn:schemas-microsoft-com:office:office" xmlns:r="http://schemas.openxmlformats.org/officeDocument/2006/relationships" xmlns:m="http://schemas.openxmlformats.org/officeDocument/2006/math" xmlns:v="urn:schemas-microsoft-com:vml" xmlns:wp14="http://schemas.microsoft.com/office/word/2010/wordprocessingDrawing" xmlns:wp="http://schemas.openxmlformats.org/drawingml/2006/wordprocessingDrawing" xmlns:w10="urn:schemas-microsoft-com:office:word" xmlns:w="http://schemas.openxmlformats.org/wordprocessingml/2006/main" xmlns:w14="http://schemas.microsoft.com/office/word/2010/wordml" xmlns:w15="http://schemas.microsoft.com/office/word/2012/wordml" xmlns:w16se="http://schemas.microsoft.com/office/word/2015/wordml/symex" xmlns:wpg="http://schemas.microsoft.com/office/word/2010/wordprocessingGroup" xmlns:wpi="http://schemas.microsoft.com/office/word/2010/wordprocessingInk" xmlns:wne="http://schemas.microsoft.com/office/word/2006/wordml" xmlns:wps="http://schemas.microsoft.com/office/word/2010/wordprocessingShape" mc:Ignorable="w14 w15 w16se wp14">
   <w:body>
     <w:p>
       <w:pPr>
@@ -452,7 +452,7 @@
                 <w:sz w:val="28"/>
                 <w:szCs w:val="28"/>
               </w:rPr>
-              <w:t>1. Ator seleciona a opção “Entre ou cadastre-se” (</w:t>
+              <w:t>1. Sistema exibe tela inicial para ação do ator (</w:t>
             </w:r>
             <w:r>
               <w:rPr>
@@ -460,27 +460,21 @@
                 <w:sz w:val="28"/>
                 <w:szCs w:val="28"/>
               </w:rPr>
-              <w:t>Tela 01</w:t>
-            </w:r>
-            <w:r>
-              <w:rPr>
-                <w:sz w:val="28"/>
-                <w:szCs w:val="28"/>
-              </w:rPr>
-              <w:t>).</w:t>
-            </w:r>
-          </w:p>
-          <w:p>
-            <w:pPr>
-              <w:spacing w:line="360" w:lineRule="auto"/>
-              <w:jc w:val="both"/>
-            </w:pPr>
-            <w:r>
-              <w:rPr>
-                <w:sz w:val="28"/>
-                <w:szCs w:val="28"/>
-              </w:rPr>
-              <w:t>2. Sistema exibe tela que oferece o acesso à 4 opções disponibilizadas pelo sistema, as quais são:</w:t>
+              <w:t>Tela 03</w:t>
+            </w:r>
+            <w:r>
+              <w:rPr>
+                <w:sz w:val="28"/>
+                <w:szCs w:val="28"/>
+              </w:rPr>
+              <w:t>)</w:t>
+            </w:r>
+            <w:r>
+              <w:rPr>
+                <w:sz w:val="28"/>
+                <w:szCs w:val="28"/>
+              </w:rPr>
+              <w:t xml:space="preserve"> que oferece o acesso à 4 opções disponibilizadas pelo sistema, as quais são:</w:t>
             </w:r>
           </w:p>
           <w:p>
@@ -754,7 +748,309 @@
                 <w:sz w:val="28"/>
                 <w:szCs w:val="28"/>
               </w:rPr>
-              <w:t>1. Ator insere seu usuário e senha, pressiona o botão “</w:t>
+              <w:t>1</w:t>
+            </w:r>
+            <w:r>
+              <w:rPr>
+                <w:sz w:val="28"/>
+                <w:szCs w:val="28"/>
+              </w:rPr>
+              <w:t>. Sistema exibe menu de mesa. (</w:t>
+            </w:r>
+            <w:r>
+              <w:rPr>
+                <w:color w:val="FF0000"/>
+                <w:sz w:val="28"/>
+                <w:szCs w:val="28"/>
+              </w:rPr>
+              <w:t>Tela 03</w:t>
+            </w:r>
+            <w:r>
+              <w:rPr>
+                <w:sz w:val="28"/>
+                <w:szCs w:val="28"/>
+              </w:rPr>
+              <w:t xml:space="preserve">) </w:t>
+            </w:r>
+          </w:p>
+          <w:p>
+            <w:pPr>
+              <w:spacing w:line="360" w:lineRule="auto"/>
+              <w:jc w:val="both"/>
+            </w:pPr>
+            <w:r>
+              <w:rPr>
+                <w:sz w:val="28"/>
+                <w:szCs w:val="28"/>
+              </w:rPr>
+              <w:t>2</w:t>
+            </w:r>
+            <w:r>
+              <w:rPr>
+                <w:sz w:val="28"/>
+                <w:szCs w:val="28"/>
+              </w:rPr>
+              <w:t>. Ator seleciona a mesa e pressiona o ícone correspondente. (</w:t>
+            </w:r>
+            <w:r>
+              <w:rPr>
+                <w:color w:val="FF0000"/>
+                <w:sz w:val="28"/>
+                <w:szCs w:val="28"/>
+              </w:rPr>
+              <w:t>Tela 03</w:t>
+            </w:r>
+            <w:r>
+              <w:rPr>
+                <w:sz w:val="28"/>
+                <w:szCs w:val="28"/>
+              </w:rPr>
+              <w:t>)</w:t>
+            </w:r>
+          </w:p>
+          <w:p>
+            <w:pPr>
+              <w:spacing w:line="360" w:lineRule="auto"/>
+              <w:jc w:val="both"/>
+            </w:pPr>
+            <w:r>
+              <w:rPr>
+                <w:sz w:val="28"/>
+                <w:szCs w:val="28"/>
+              </w:rPr>
+              <w:t>3</w:t>
+            </w:r>
+            <w:r>
+              <w:rPr>
+                <w:sz w:val="28"/>
+                <w:szCs w:val="28"/>
+              </w:rPr>
+              <w:t>. Sistema exibe menu de cliente. (</w:t>
+            </w:r>
+            <w:r>
+              <w:rPr>
+                <w:color w:val="FF0000"/>
+                <w:sz w:val="28"/>
+                <w:szCs w:val="28"/>
+              </w:rPr>
+              <w:t>Tela 04</w:t>
+            </w:r>
+            <w:r>
+              <w:rPr>
+                <w:sz w:val="28"/>
+                <w:szCs w:val="28"/>
+              </w:rPr>
+              <w:t xml:space="preserve">) </w:t>
+            </w:r>
+          </w:p>
+          <w:p>
+            <w:pPr>
+              <w:spacing w:line="360" w:lineRule="auto"/>
+              <w:jc w:val="both"/>
+            </w:pPr>
+            <w:r>
+              <w:rPr>
+                <w:sz w:val="28"/>
+                <w:szCs w:val="28"/>
+              </w:rPr>
+              <w:lastRenderedPageBreak/>
+              <w:t>4</w:t>
+            </w:r>
+            <w:r>
+              <w:rPr>
+                <w:sz w:val="28"/>
+                <w:szCs w:val="28"/>
+              </w:rPr>
+              <w:t>.</w:t>
+            </w:r>
+            <w:r>
+              <w:rPr>
+                <w:sz w:val="28"/>
+                <w:szCs w:val="28"/>
+              </w:rPr>
+              <w:t xml:space="preserve"> Ator seleciona a cliente e pressiona o ícone correspondente. (</w:t>
+            </w:r>
+            <w:r>
+              <w:rPr>
+                <w:color w:val="FF0000"/>
+                <w:sz w:val="28"/>
+                <w:szCs w:val="28"/>
+              </w:rPr>
+              <w:t>Tela 04</w:t>
+            </w:r>
+            <w:r>
+              <w:rPr>
+                <w:sz w:val="28"/>
+                <w:szCs w:val="28"/>
+              </w:rPr>
+              <w:t xml:space="preserve">) </w:t>
+            </w:r>
+          </w:p>
+          <w:p>
+            <w:pPr>
+              <w:spacing w:line="360" w:lineRule="auto"/>
+              <w:jc w:val="both"/>
+            </w:pPr>
+            <w:r>
+              <w:rPr>
+                <w:sz w:val="28"/>
+                <w:szCs w:val="28"/>
+              </w:rPr>
+              <w:t>5</w:t>
+            </w:r>
+            <w:r>
+              <w:rPr>
+                <w:sz w:val="28"/>
+                <w:szCs w:val="28"/>
+              </w:rPr>
+              <w:t>. Sistema exibe menu de categoria. (</w:t>
+            </w:r>
+            <w:r>
+              <w:rPr>
+                <w:color w:val="FF0000"/>
+                <w:sz w:val="28"/>
+                <w:szCs w:val="28"/>
+              </w:rPr>
+              <w:t>Tela 05</w:t>
+            </w:r>
+            <w:r>
+              <w:rPr>
+                <w:sz w:val="28"/>
+                <w:szCs w:val="28"/>
+              </w:rPr>
+              <w:t xml:space="preserve">) </w:t>
+            </w:r>
+          </w:p>
+          <w:p>
+            <w:pPr>
+              <w:spacing w:line="360" w:lineRule="auto"/>
+              <w:jc w:val="both"/>
+            </w:pPr>
+            <w:r>
+              <w:rPr>
+                <w:sz w:val="28"/>
+                <w:szCs w:val="28"/>
+              </w:rPr>
+              <w:t>6</w:t>
+            </w:r>
+            <w:r>
+              <w:rPr>
+                <w:sz w:val="28"/>
+                <w:szCs w:val="28"/>
+              </w:rPr>
+              <w:t>. Ator seleciona a categoria e pressiona o ícone correspondente. (</w:t>
+            </w:r>
+            <w:r>
+              <w:rPr>
+                <w:color w:val="FF0000"/>
+                <w:sz w:val="28"/>
+                <w:szCs w:val="28"/>
+              </w:rPr>
+              <w:t>Tela 05</w:t>
+            </w:r>
+            <w:r>
+              <w:rPr>
+                <w:sz w:val="28"/>
+                <w:szCs w:val="28"/>
+              </w:rPr>
+              <w:t xml:space="preserve">) </w:t>
+            </w:r>
+          </w:p>
+          <w:p>
+            <w:pPr>
+              <w:spacing w:line="360" w:lineRule="auto"/>
+              <w:jc w:val="both"/>
+            </w:pPr>
+            <w:r>
+              <w:rPr>
+                <w:sz w:val="28"/>
+                <w:szCs w:val="28"/>
+              </w:rPr>
+              <w:t>7</w:t>
+            </w:r>
+            <w:r>
+              <w:rPr>
+                <w:sz w:val="28"/>
+                <w:szCs w:val="28"/>
+              </w:rPr>
+              <w:t>. Sistema exibe menu pedido. (</w:t>
+            </w:r>
+            <w:r>
+              <w:rPr>
+                <w:color w:val="FF0000"/>
+                <w:sz w:val="28"/>
+                <w:szCs w:val="28"/>
+              </w:rPr>
+              <w:t>Tela 06</w:t>
+            </w:r>
+            <w:r>
+              <w:rPr>
+                <w:sz w:val="28"/>
+                <w:szCs w:val="28"/>
+              </w:rPr>
+              <w:t>)</w:t>
+            </w:r>
+          </w:p>
+          <w:p>
+            <w:pPr>
+              <w:spacing w:line="360" w:lineRule="auto"/>
+              <w:jc w:val="both"/>
+            </w:pPr>
+            <w:r>
+              <w:rPr>
+                <w:sz w:val="28"/>
+                <w:szCs w:val="28"/>
+              </w:rPr>
+              <w:t>8</w:t>
+            </w:r>
+            <w:r>
+              <w:rPr>
+                <w:sz w:val="28"/>
+                <w:szCs w:val="28"/>
+              </w:rPr>
+              <w:t>. Ator seleciona o</w:t>
+            </w:r>
+            <w:r>
+              <w:rPr>
+                <w:sz w:val="28"/>
+                <w:szCs w:val="28"/>
+              </w:rPr>
+              <w:t xml:space="preserve"> pedido e pressiona a ícone correspondente. (</w:t>
+            </w:r>
+            <w:r>
+              <w:rPr>
+                <w:color w:val="FF0000"/>
+                <w:sz w:val="28"/>
+                <w:szCs w:val="28"/>
+              </w:rPr>
+              <w:t>Tela 06</w:t>
+            </w:r>
+            <w:r>
+              <w:rPr>
+                <w:sz w:val="28"/>
+                <w:szCs w:val="28"/>
+              </w:rPr>
+              <w:t>)</w:t>
+            </w:r>
+          </w:p>
+          <w:p>
+            <w:pPr>
+              <w:spacing w:line="360" w:lineRule="auto"/>
+              <w:jc w:val="both"/>
+            </w:pPr>
+            <w:r>
+              <w:rPr>
+                <w:sz w:val="28"/>
+                <w:szCs w:val="28"/>
+              </w:rPr>
+              <w:t>9</w:t>
+            </w:r>
+            <w:r>
+              <w:rPr>
+                <w:sz w:val="28"/>
+                <w:szCs w:val="28"/>
+              </w:rPr>
+              <w:t>. Sistema adiciona pedido ao “</w:t>
             </w:r>
             <w:r>
               <w:rPr>
@@ -763,7 +1059,7 @@
                 <w:sz w:val="28"/>
                 <w:szCs w:val="28"/>
               </w:rPr>
-              <w:t>Entrar</w:t>
+              <w:t>carrinho de compras</w:t>
             </w:r>
             <w:r>
               <w:rPr>
@@ -778,7 +1074,7 @@
                 <w:sz w:val="28"/>
                 <w:szCs w:val="28"/>
               </w:rPr>
-              <w:t>Tela 01</w:t>
+              <w:t>Tela 06</w:t>
             </w:r>
             <w:r>
               <w:rPr>
@@ -798,267 +1094,14 @@
                 <w:sz w:val="28"/>
                 <w:szCs w:val="28"/>
               </w:rPr>
-              <w:t xml:space="preserve">1. Sistema verifica se o dado informado já foi cadastrado, conforme meio </w:t>
-            </w:r>
-            <w:r>
-              <w:rPr>
-                <w:sz w:val="28"/>
-                <w:szCs w:val="28"/>
-              </w:rPr>
-              <w:lastRenderedPageBreak/>
-              <w:t>persistente. (</w:t>
-            </w:r>
-            <w:r>
-              <w:rPr>
-                <w:color w:val="FF0000"/>
-                <w:sz w:val="28"/>
-                <w:szCs w:val="28"/>
-              </w:rPr>
-              <w:t>Tela 01</w:t>
-            </w:r>
-            <w:r>
-              <w:rPr>
-                <w:sz w:val="28"/>
-                <w:szCs w:val="28"/>
-              </w:rPr>
-              <w:t>)</w:t>
-            </w:r>
-          </w:p>
-          <w:p>
-            <w:pPr>
-              <w:spacing w:line="360" w:lineRule="auto"/>
-              <w:jc w:val="both"/>
-            </w:pPr>
-            <w:r>
-              <w:rPr>
-                <w:sz w:val="28"/>
-                <w:szCs w:val="28"/>
-              </w:rPr>
-              <w:t>2. Sistema exibe menu de mesa. (</w:t>
-            </w:r>
-            <w:r>
-              <w:rPr>
-                <w:color w:val="FF0000"/>
-                <w:sz w:val="28"/>
-                <w:szCs w:val="28"/>
-              </w:rPr>
-              <w:t>Tela 03</w:t>
-            </w:r>
-            <w:r>
-              <w:rPr>
-                <w:sz w:val="28"/>
-                <w:szCs w:val="28"/>
-              </w:rPr>
-              <w:t xml:space="preserve">) </w:t>
-            </w:r>
-          </w:p>
-          <w:p>
-            <w:pPr>
-              <w:spacing w:line="360" w:lineRule="auto"/>
-              <w:jc w:val="both"/>
-            </w:pPr>
-            <w:r>
-              <w:rPr>
-                <w:sz w:val="28"/>
-                <w:szCs w:val="28"/>
-              </w:rPr>
-              <w:t>3. Ator seleciona a mesa e pressiona o ícone correspondente. (</w:t>
-            </w:r>
-            <w:r>
-              <w:rPr>
-                <w:color w:val="FF0000"/>
-                <w:sz w:val="28"/>
-                <w:szCs w:val="28"/>
-              </w:rPr>
-              <w:t>Tela 03</w:t>
-            </w:r>
-            <w:r>
-              <w:rPr>
-                <w:sz w:val="28"/>
-                <w:szCs w:val="28"/>
-              </w:rPr>
-              <w:t>)</w:t>
-            </w:r>
-          </w:p>
-          <w:p>
-            <w:pPr>
-              <w:spacing w:line="360" w:lineRule="auto"/>
-              <w:jc w:val="both"/>
-            </w:pPr>
-            <w:r>
-              <w:rPr>
-                <w:sz w:val="28"/>
-                <w:szCs w:val="28"/>
-              </w:rPr>
-              <w:t>4. Sistema exibe menu de cliente. (</w:t>
-            </w:r>
-            <w:r>
-              <w:rPr>
-                <w:color w:val="FF0000"/>
-                <w:sz w:val="28"/>
-                <w:szCs w:val="28"/>
-              </w:rPr>
-              <w:t>Tela 04</w:t>
-            </w:r>
-            <w:r>
-              <w:rPr>
-                <w:sz w:val="28"/>
-                <w:szCs w:val="28"/>
-              </w:rPr>
-              <w:t xml:space="preserve">) </w:t>
-            </w:r>
-          </w:p>
-          <w:p>
-            <w:pPr>
-              <w:spacing w:line="360" w:lineRule="auto"/>
-              <w:jc w:val="both"/>
-            </w:pPr>
-            <w:r>
-              <w:rPr>
-                <w:sz w:val="28"/>
-                <w:szCs w:val="28"/>
-              </w:rPr>
-              <w:t>5. Ator seleciona a cliente e pressiona o ícone correspondente. (</w:t>
-            </w:r>
-            <w:r>
-              <w:rPr>
-                <w:color w:val="FF0000"/>
-                <w:sz w:val="28"/>
-                <w:szCs w:val="28"/>
-              </w:rPr>
-              <w:t>Tela 04</w:t>
-            </w:r>
-            <w:r>
-              <w:rPr>
-                <w:sz w:val="28"/>
-                <w:szCs w:val="28"/>
-              </w:rPr>
-              <w:t xml:space="preserve">) </w:t>
-            </w:r>
-          </w:p>
-          <w:p>
-            <w:pPr>
-              <w:spacing w:line="360" w:lineRule="auto"/>
-              <w:jc w:val="both"/>
-            </w:pPr>
-            <w:r>
-              <w:rPr>
-                <w:sz w:val="28"/>
-                <w:szCs w:val="28"/>
-              </w:rPr>
-              <w:t>6. Sistema exibe menu de categoria. (</w:t>
-            </w:r>
-            <w:r>
-              <w:rPr>
-                <w:color w:val="FF0000"/>
-                <w:sz w:val="28"/>
-                <w:szCs w:val="28"/>
-              </w:rPr>
-              <w:t>Tela 05</w:t>
-            </w:r>
-            <w:r>
-              <w:rPr>
-                <w:sz w:val="28"/>
-                <w:szCs w:val="28"/>
-              </w:rPr>
-              <w:t xml:space="preserve">) </w:t>
-            </w:r>
-          </w:p>
-          <w:p>
-            <w:pPr>
-              <w:spacing w:line="360" w:lineRule="auto"/>
-              <w:jc w:val="both"/>
-            </w:pPr>
-            <w:r>
-              <w:rPr>
-                <w:sz w:val="28"/>
-                <w:szCs w:val="28"/>
-              </w:rPr>
-              <w:t>7. Ator seleciona a categoria e pressiona o ícone correspondente. (</w:t>
-            </w:r>
-            <w:r>
-              <w:rPr>
-                <w:color w:val="FF0000"/>
-                <w:sz w:val="28"/>
-                <w:szCs w:val="28"/>
-              </w:rPr>
-              <w:t>Tela 05</w:t>
-            </w:r>
-            <w:r>
-              <w:rPr>
-                <w:sz w:val="28"/>
-                <w:szCs w:val="28"/>
-              </w:rPr>
-              <w:t xml:space="preserve">) </w:t>
-            </w:r>
-          </w:p>
-          <w:p>
-            <w:pPr>
-              <w:spacing w:line="360" w:lineRule="auto"/>
-              <w:jc w:val="both"/>
-            </w:pPr>
-            <w:r>
-              <w:rPr>
-                <w:sz w:val="28"/>
-                <w:szCs w:val="28"/>
-              </w:rPr>
-              <w:t>8. Sistema exibe menu pedido. (</w:t>
-            </w:r>
-            <w:r>
-              <w:rPr>
-                <w:color w:val="FF0000"/>
-                <w:sz w:val="28"/>
-                <w:szCs w:val="28"/>
-              </w:rPr>
-              <w:t>Tela 06</w:t>
-            </w:r>
-            <w:r>
-              <w:rPr>
-                <w:sz w:val="28"/>
-                <w:szCs w:val="28"/>
-              </w:rPr>
-              <w:t>)</w:t>
-            </w:r>
-          </w:p>
-          <w:p>
-            <w:pPr>
-              <w:spacing w:line="360" w:lineRule="auto"/>
-              <w:jc w:val="both"/>
-            </w:pPr>
-            <w:r>
-              <w:rPr>
-                <w:sz w:val="28"/>
-                <w:szCs w:val="28"/>
-              </w:rPr>
-              <w:t>9. Ator seleciona o pedido e pressiona a ícone correspondente. (</w:t>
-            </w:r>
-            <w:r>
-              <w:rPr>
-                <w:color w:val="FF0000"/>
-                <w:sz w:val="28"/>
-                <w:szCs w:val="28"/>
-              </w:rPr>
-              <w:t>Tela 06</w:t>
-            </w:r>
-            <w:r>
-              <w:rPr>
-                <w:sz w:val="28"/>
-                <w:szCs w:val="28"/>
-              </w:rPr>
-              <w:t>)</w:t>
-            </w:r>
-          </w:p>
-          <w:p>
-            <w:pPr>
-              <w:spacing w:line="360" w:lineRule="auto"/>
-              <w:jc w:val="both"/>
-            </w:pPr>
-            <w:r>
-              <w:rPr>
-                <w:sz w:val="28"/>
-                <w:szCs w:val="28"/>
-              </w:rPr>
-              <w:t>10. Sistema adiciona pedido ao “</w:t>
+              <w:t>10</w:t>
+            </w:r>
+            <w:r>
+              <w:rPr>
+                <w:sz w:val="28"/>
+                <w:szCs w:val="28"/>
+              </w:rPr>
+              <w:t>. Ator pressiona o ícone do “</w:t>
             </w:r>
             <w:r>
               <w:rPr>
@@ -1102,7 +1145,14 @@
                 <w:sz w:val="28"/>
                 <w:szCs w:val="28"/>
               </w:rPr>
-              <w:t>11. Ator pressiona o ícone do “</w:t>
+              <w:t>11</w:t>
+            </w:r>
+            <w:r>
+              <w:rPr>
+                <w:sz w:val="28"/>
+                <w:szCs w:val="28"/>
+              </w:rPr>
+              <w:t>. Sistema exibe menu do “</w:t>
             </w:r>
             <w:r>
               <w:rPr>
@@ -1126,7 +1176,7 @@
                 <w:sz w:val="28"/>
                 <w:szCs w:val="28"/>
               </w:rPr>
-              <w:t>Tela 06</w:t>
+              <w:t>Tela 07</w:t>
             </w:r>
             <w:r>
               <w:rPr>
@@ -1146,7 +1196,21 @@
                 <w:sz w:val="28"/>
                 <w:szCs w:val="28"/>
               </w:rPr>
-              <w:t>12. Sistema exibe menu do “</w:t>
+              <w:t>12</w:t>
+            </w:r>
+            <w:r>
+              <w:rPr>
+                <w:sz w:val="28"/>
+                <w:szCs w:val="28"/>
+              </w:rPr>
+              <w:t>. Ator pressio</w:t>
+            </w:r>
+            <w:r>
+              <w:rPr>
+                <w:sz w:val="28"/>
+                <w:szCs w:val="28"/>
+              </w:rPr>
+              <w:t>na botão “</w:t>
             </w:r>
             <w:r>
               <w:rPr>
@@ -1155,7 +1219,7 @@
                 <w:sz w:val="28"/>
                 <w:szCs w:val="28"/>
               </w:rPr>
-              <w:t>carrinho de compras</w:t>
+              <w:t>Finalizar Pedido</w:t>
             </w:r>
             <w:r>
               <w:rPr>
@@ -1190,7 +1254,99 @@
                 <w:sz w:val="28"/>
                 <w:szCs w:val="28"/>
               </w:rPr>
-              <w:t>13. Ator pressiona botão “</w:t>
+              <w:t>13</w:t>
+            </w:r>
+            <w:r>
+              <w:rPr>
+                <w:sz w:val="28"/>
+                <w:szCs w:val="28"/>
+              </w:rPr>
+              <w:t>. Sistema grava dados informados em meio persistente. (</w:t>
+            </w:r>
+            <w:r>
+              <w:rPr>
+                <w:color w:val="FF0000"/>
+                <w:sz w:val="28"/>
+                <w:szCs w:val="28"/>
+              </w:rPr>
+              <w:t>Tela 07</w:t>
+            </w:r>
+            <w:r>
+              <w:rPr>
+                <w:sz w:val="28"/>
+                <w:szCs w:val="28"/>
+              </w:rPr>
+              <w:t>)</w:t>
+            </w:r>
+          </w:p>
+        </w:tc>
+      </w:tr>
+      <w:tr>
+        <w:tc>
+          <w:tcPr>
+            <w:tcW w:w="9628" w:type="dxa"/>
+            <w:tcBorders>
+              <w:top w:val="single" w:sz="4" w:space="0" w:color="000000"/>
+              <w:left w:val="single" w:sz="4" w:space="0" w:color="000000"/>
+              <w:bottom w:val="single" w:sz="4" w:space="0" w:color="000000"/>
+              <w:right w:val="single" w:sz="4" w:space="0" w:color="000000"/>
+            </w:tcBorders>
+          </w:tcPr>
+          <w:p>
+            <w:pPr>
+              <w:spacing w:line="360" w:lineRule="auto"/>
+              <w:jc w:val="center"/>
+            </w:pPr>
+            <w:r>
+              <w:rPr>
+                <w:b/>
+                <w:sz w:val="28"/>
+                <w:szCs w:val="28"/>
+              </w:rPr>
+              <w:lastRenderedPageBreak/>
+              <w:t>Fluxo alternativo</w:t>
+            </w:r>
+          </w:p>
+        </w:tc>
+      </w:tr>
+      <w:tr>
+        <w:tc>
+          <w:tcPr>
+            <w:tcW w:w="9628" w:type="dxa"/>
+            <w:tcBorders>
+              <w:top w:val="single" w:sz="4" w:space="0" w:color="000000"/>
+              <w:left w:val="single" w:sz="4" w:space="0" w:color="000000"/>
+              <w:bottom w:val="single" w:sz="4" w:space="0" w:color="000000"/>
+              <w:right w:val="single" w:sz="4" w:space="0" w:color="000000"/>
+            </w:tcBorders>
+          </w:tcPr>
+          <w:p>
+            <w:pPr>
+              <w:spacing w:line="360" w:lineRule="auto"/>
+              <w:jc w:val="both"/>
+            </w:pPr>
+            <w:r>
+              <w:rPr>
+                <w:b/>
+                <w:sz w:val="28"/>
+                <w:szCs w:val="28"/>
+              </w:rPr>
+              <w:t>Passo 11</w:t>
+            </w:r>
+            <w:r>
+              <w:rPr>
+                <w:b/>
+                <w:sz w:val="28"/>
+                <w:szCs w:val="28"/>
+              </w:rPr>
+              <w:t xml:space="preserve">: </w:t>
+            </w:r>
+            <w:r>
+              <w:rPr>
+                <w:sz w:val="28"/>
+                <w:szCs w:val="28"/>
+              </w:rPr>
+              <w:t>Caso o ator pressione o ícone “</w:t>
             </w:r>
             <w:r>
               <w:rPr>
@@ -1199,127 +1355,6 @@
                 <w:sz w:val="28"/>
                 <w:szCs w:val="28"/>
               </w:rPr>
-              <w:t>Finalizar Pedido</w:t>
-            </w:r>
-            <w:r>
-              <w:rPr>
-                <w:sz w:val="28"/>
-                <w:szCs w:val="28"/>
-              </w:rPr>
-              <w:t>”. (</w:t>
-            </w:r>
-            <w:r>
-              <w:rPr>
-                <w:color w:val="FF0000"/>
-                <w:sz w:val="28"/>
-                <w:szCs w:val="28"/>
-              </w:rPr>
-              <w:t>Tela 07</w:t>
-            </w:r>
-            <w:r>
-              <w:rPr>
-                <w:sz w:val="28"/>
-                <w:szCs w:val="28"/>
-              </w:rPr>
-              <w:t>)</w:t>
-            </w:r>
-          </w:p>
-          <w:p>
-            <w:pPr>
-              <w:spacing w:line="360" w:lineRule="auto"/>
-              <w:jc w:val="both"/>
-            </w:pPr>
-            <w:r>
-              <w:rPr>
-                <w:sz w:val="28"/>
-                <w:szCs w:val="28"/>
-              </w:rPr>
-              <w:t>14. Sistema grava dados informados em meio persistente. (</w:t>
-            </w:r>
-            <w:r>
-              <w:rPr>
-                <w:color w:val="FF0000"/>
-                <w:sz w:val="28"/>
-                <w:szCs w:val="28"/>
-              </w:rPr>
-              <w:t>Tela 07</w:t>
-            </w:r>
-            <w:r>
-              <w:rPr>
-                <w:sz w:val="28"/>
-                <w:szCs w:val="28"/>
-              </w:rPr>
-              <w:t>)</w:t>
-            </w:r>
-          </w:p>
-        </w:tc>
-      </w:tr>
-      <w:tr>
-        <w:tc>
-          <w:tcPr>
-            <w:tcW w:w="9628" w:type="dxa"/>
-            <w:tcBorders>
-              <w:top w:val="single" w:sz="4" w:space="0" w:color="000000"/>
-              <w:left w:val="single" w:sz="4" w:space="0" w:color="000000"/>
-              <w:bottom w:val="single" w:sz="4" w:space="0" w:color="000000"/>
-              <w:right w:val="single" w:sz="4" w:space="0" w:color="000000"/>
-            </w:tcBorders>
-          </w:tcPr>
-          <w:p>
-            <w:pPr>
-              <w:spacing w:line="360" w:lineRule="auto"/>
-              <w:jc w:val="center"/>
-            </w:pPr>
-            <w:r>
-              <w:rPr>
-                <w:b/>
-                <w:sz w:val="28"/>
-                <w:szCs w:val="28"/>
-              </w:rPr>
-              <w:lastRenderedPageBreak/>
-              <w:t>Fluxo alternativo</w:t>
-            </w:r>
-          </w:p>
-        </w:tc>
-      </w:tr>
-      <w:tr>
-        <w:tc>
-          <w:tcPr>
-            <w:tcW w:w="9628" w:type="dxa"/>
-            <w:tcBorders>
-              <w:top w:val="single" w:sz="4" w:space="0" w:color="000000"/>
-              <w:left w:val="single" w:sz="4" w:space="0" w:color="000000"/>
-              <w:bottom w:val="single" w:sz="4" w:space="0" w:color="000000"/>
-              <w:right w:val="single" w:sz="4" w:space="0" w:color="000000"/>
-            </w:tcBorders>
-          </w:tcPr>
-          <w:p>
-            <w:pPr>
-              <w:spacing w:line="360" w:lineRule="auto"/>
-              <w:jc w:val="both"/>
-            </w:pPr>
-            <w:r>
-              <w:rPr>
-                <w:b/>
-                <w:sz w:val="28"/>
-                <w:szCs w:val="28"/>
-              </w:rPr>
-              <w:t xml:space="preserve">Passo 12: </w:t>
-            </w:r>
-            <w:r>
-              <w:rPr>
-                <w:sz w:val="28"/>
-                <w:szCs w:val="28"/>
-              </w:rPr>
-              <w:t>Caso o ator pressione o ícone “</w:t>
-            </w:r>
-            <w:r>
-              <w:rPr>
-                <w:b/>
-                <w:bCs/>
-                <w:sz w:val="28"/>
-                <w:szCs w:val="28"/>
-              </w:rPr>
               <w:t>X</w:t>
             </w:r>
             <w:r>
@@ -1327,84 +1362,7 @@
                 <w:sz w:val="28"/>
                 <w:szCs w:val="28"/>
               </w:rPr>
-              <w:t>”, o pedido é retirado da lista de pagamento.</w:t>
-            </w:r>
-          </w:p>
-        </w:tc>
-      </w:tr>
-      <w:tr>
-        <w:tc>
-          <w:tcPr>
-            <w:tcW w:w="9628" w:type="dxa"/>
-            <w:tcBorders>
-              <w:top w:val="single" w:sz="4" w:space="0" w:color="000000"/>
-              <w:left w:val="single" w:sz="4" w:space="0" w:color="000000"/>
-              <w:bottom w:val="single" w:sz="4" w:space="0" w:color="000000"/>
-              <w:right w:val="single" w:sz="4" w:space="0" w:color="000000"/>
-            </w:tcBorders>
-          </w:tcPr>
-          <w:p>
-            <w:pPr>
-              <w:spacing w:line="360" w:lineRule="auto"/>
-              <w:jc w:val="center"/>
-            </w:pPr>
-            <w:r>
-              <w:rPr>
-                <w:b/>
-                <w:sz w:val="28"/>
-                <w:szCs w:val="28"/>
-              </w:rPr>
-              <w:t>Fluxos de Exceção</w:t>
-            </w:r>
-          </w:p>
-        </w:tc>
-      </w:tr>
-      <w:tr>
-        <w:tc>
-          <w:tcPr>
-            <w:tcW w:w="9628" w:type="dxa"/>
-            <w:tcBorders>
-              <w:top w:val="single" w:sz="4" w:space="0" w:color="000000"/>
-              <w:left w:val="single" w:sz="4" w:space="0" w:color="000000"/>
-              <w:bottom w:val="single" w:sz="4" w:space="0" w:color="000000"/>
-              <w:right w:val="single" w:sz="4" w:space="0" w:color="000000"/>
-            </w:tcBorders>
-          </w:tcPr>
-          <w:p>
-            <w:pPr>
-              <w:spacing w:line="360" w:lineRule="auto"/>
-              <w:jc w:val="both"/>
-            </w:pPr>
-            <w:r>
-              <w:rPr>
-                <w:b/>
-                <w:sz w:val="28"/>
-                <w:szCs w:val="28"/>
-              </w:rPr>
-              <w:t xml:space="preserve">Passo 2: </w:t>
-            </w:r>
-            <w:r>
-              <w:rPr>
-                <w:sz w:val="28"/>
-                <w:szCs w:val="28"/>
-              </w:rPr>
-              <w:t>Usuário não possui cadastro. Sistema exibe mensagem “</w:t>
-            </w:r>
-            <w:r>
-              <w:rPr>
-                <w:b/>
-                <w:bCs/>
-                <w:sz w:val="28"/>
-                <w:szCs w:val="28"/>
-              </w:rPr>
-              <w:t>Usuário ou senha incorreta</w:t>
-            </w:r>
-            <w:r>
-              <w:rPr>
-                <w:sz w:val="28"/>
-                <w:szCs w:val="28"/>
-              </w:rPr>
-              <w:t xml:space="preserve">”. </w:t>
+              <w:t>” em algum dos itens, irá aparecer um pop-up perguntando: “Deseja remover o item?”, com as opções sim ou não.</w:t>
             </w:r>
           </w:p>
         </w:tc>
@@ -1596,7 +1554,14 @@
                 <w:sz w:val="28"/>
                 <w:szCs w:val="28"/>
               </w:rPr>
-              <w:t>2. Ator seleciona a mesa e pressiona o ícone correspondente. (</w:t>
+              <w:t xml:space="preserve">2. Ator seleciona a mesa e pressiona o ícone </w:t>
+            </w:r>
+            <w:r>
+              <w:rPr>
+                <w:sz w:val="28"/>
+                <w:szCs w:val="28"/>
+              </w:rPr>
+              <w:t>correspondente. (</w:t>
             </w:r>
             <w:r>
               <w:rPr>
@@ -1624,7 +1589,6 @@
                 <w:sz w:val="28"/>
                 <w:szCs w:val="28"/>
               </w:rPr>
-              <w:lastRenderedPageBreak/>
               <w:t>3. Sistema exibe menu de cliente. (</w:t>
             </w:r>
             <w:r>
@@ -1753,7 +1717,14 @@
                 <w:sz w:val="28"/>
                 <w:szCs w:val="28"/>
               </w:rPr>
-              <w:t>7. Sistema exibe tela de status. (</w:t>
+              <w:t xml:space="preserve">7. </w:t>
+            </w:r>
+            <w:r>
+              <w:rPr>
+                <w:sz w:val="28"/>
+                <w:szCs w:val="28"/>
+              </w:rPr>
+              <w:t>Sistema exibe tela de status. (</w:t>
             </w:r>
             <w:r>
               <w:rPr>
@@ -1799,7 +1770,6 @@
                 <w:sz w:val="28"/>
                 <w:szCs w:val="28"/>
               </w:rPr>
-              <w:lastRenderedPageBreak/>
               <w:t>Fluxo alternativo</w:t>
             </w:r>
           </w:p>
@@ -1864,7 +1834,15 @@
                 <w:sz w:val="28"/>
                 <w:szCs w:val="28"/>
               </w:rPr>
-              <w:t>sistema exibe (</w:t>
+              <w:t xml:space="preserve">sistema exibe </w:t>
+            </w:r>
+            <w:r>
+              <w:rPr>
+                <w:sz w:val="28"/>
+                <w:szCs w:val="28"/>
+              </w:rPr>
+              <w:lastRenderedPageBreak/>
+              <w:t>(</w:t>
             </w:r>
             <w:r>
               <w:rPr>
@@ -2061,7 +2039,14 @@
                 <w:sz w:val="28"/>
                 <w:szCs w:val="28"/>
               </w:rPr>
-              <w:t>1. Sistema exibe menu de mesa. (</w:t>
+              <w:t xml:space="preserve">1. Sistema exibe </w:t>
+            </w:r>
+            <w:r>
+              <w:rPr>
+                <w:sz w:val="28"/>
+                <w:szCs w:val="28"/>
+              </w:rPr>
+              <w:t>menu de mesa. (</w:t>
             </w:r>
             <w:r>
               <w:rPr>
@@ -2181,7 +2166,15 @@
                 <w:sz w:val="28"/>
                 <w:szCs w:val="28"/>
               </w:rPr>
-              <w:t>Tela 05</w:t>
+              <w:t>Tel</w:t>
+            </w:r>
+            <w:r>
+              <w:rPr>
+                <w:color w:val="FF0000"/>
+                <w:sz w:val="28"/>
+                <w:szCs w:val="28"/>
+              </w:rPr>
+              <w:t>a 05</w:t>
             </w:r>
             <w:r>
               <w:rPr>
@@ -2385,7 +2378,14 @@
                 <w:sz w:val="28"/>
                 <w:szCs w:val="28"/>
               </w:rPr>
-              <w:t>”, o pedido é retirado da lista de pedidos.</w:t>
+              <w:t>”, o pedido é retirado da lista</w:t>
+            </w:r>
+            <w:r>
+              <w:rPr>
+                <w:sz w:val="28"/>
+                <w:szCs w:val="28"/>
+              </w:rPr>
+              <w:t xml:space="preserve"> de pedidos.</w:t>
             </w:r>
           </w:p>
           <w:p>
@@ -2399,23 +2399,7 @@
                 <w:sz w:val="28"/>
                 <w:szCs w:val="28"/>
               </w:rPr>
-              <w:t xml:space="preserve">Passo </w:t>
-            </w:r>
-            <w:r>
-              <w:rPr>
-                <w:b/>
-                <w:sz w:val="28"/>
-                <w:szCs w:val="28"/>
-              </w:rPr>
-              <w:t>5</w:t>
-            </w:r>
-            <w:r>
-              <w:rPr>
-                <w:b/>
-                <w:sz w:val="28"/>
-                <w:szCs w:val="28"/>
-              </w:rPr>
-              <w:t xml:space="preserve">: </w:t>
+              <w:t xml:space="preserve">Passo 5: </w:t>
             </w:r>
             <w:r>
               <w:rPr>
@@ -2438,15 +2422,7 @@
                 <w:sz w:val="28"/>
                 <w:szCs w:val="28"/>
               </w:rPr>
-              <w:t xml:space="preserve">”, sistema exibe </w:t>
-            </w:r>
-            <w:r>
-              <w:rPr>
-                <w:sz w:val="28"/>
-                <w:szCs w:val="28"/>
-              </w:rPr>
-              <w:lastRenderedPageBreak/>
-              <w:t>(</w:t>
+              <w:t>”, sistema exibe (</w:t>
             </w:r>
             <w:r>
               <w:rPr>
@@ -2650,7 +2626,15 @@
                 <w:sz w:val="28"/>
                 <w:szCs w:val="28"/>
               </w:rPr>
-              <w:t>2. Ator seleciona a mesa e pressiona o ícone correspondente. (</w:t>
+              <w:lastRenderedPageBreak/>
+              <w:t xml:space="preserve">2. Ator seleciona a mesa e pressiona o ícone </w:t>
+            </w:r>
+            <w:r>
+              <w:rPr>
+                <w:sz w:val="28"/>
+                <w:szCs w:val="28"/>
+              </w:rPr>
+              <w:t>correspondente. (</w:t>
             </w:r>
             <w:r>
               <w:rPr>
@@ -2806,7 +2790,14 @@
                 <w:sz w:val="28"/>
                 <w:szCs w:val="28"/>
               </w:rPr>
-              <w:t>7. Sistema exibe tela de status. (</w:t>
+              <w:t>7. Sistema exibe</w:t>
+            </w:r>
+            <w:r>
+              <w:rPr>
+                <w:sz w:val="28"/>
+                <w:szCs w:val="28"/>
+              </w:rPr>
+              <w:t xml:space="preserve"> tela de status. (</w:t>
             </w:r>
             <w:r>
               <w:rPr>
@@ -2895,6 +2886,7 @@
                 <w:sz w:val="28"/>
                 <w:szCs w:val="28"/>
               </w:rPr>
+              <w:lastRenderedPageBreak/>
               <w:t>Fluxo alternativo</w:t>
             </w:r>
           </w:p>
@@ -2949,14 +2941,7 @@
                 <w:sz w:val="28"/>
                 <w:szCs w:val="28"/>
               </w:rPr>
-              <w:t>”, sistema exibe</w:t>
-            </w:r>
-            <w:r>
-              <w:rPr>
-                <w:sz w:val="28"/>
-                <w:szCs w:val="28"/>
-              </w:rPr>
-              <w:t xml:space="preserve"> </w:t>
+              <w:t xml:space="preserve">”, sistema exibe </w:t>
             </w:r>
             <w:r>
               <w:rPr>
@@ -3132,7 +3117,6 @@
               <w:spacing w:line="360" w:lineRule="auto"/>
               <w:jc w:val="center"/>
             </w:pPr>
-            <w:proofErr w:type="spellStart"/>
             <w:r>
               <w:rPr>
                 <w:sz w:val="28"/>
@@ -3140,7 +3124,6 @@
               </w:rPr>
               <w:t>Talysson</w:t>
             </w:r>
-            <w:proofErr w:type="spellEnd"/>
             <w:r>
               <w:rPr>
                 <w:sz w:val="28"/>
@@ -3220,18 +3203,12 @@
                 <w:tab w:val="left" w:pos="449"/>
               </w:tabs>
               <w:spacing w:line="360" w:lineRule="auto"/>
-              <w:rPr>
-                <w:sz w:val="28"/>
-                <w:szCs w:val="28"/>
-              </w:rPr>
-            </w:pPr>
-            <w:r>
-              <w:rPr>
-                <w:sz w:val="28"/>
-                <w:szCs w:val="28"/>
-              </w:rPr>
-              <w:tab/>
-            </w:r>
+              <w:jc w:val="center"/>
+              <w:rPr>
+                <w:sz w:val="28"/>
+                <w:szCs w:val="28"/>
+              </w:rPr>
+            </w:pPr>
             <w:proofErr w:type="spellStart"/>
             <w:r>
               <w:rPr>
@@ -3282,6 +3259,95 @@
                 <w:szCs w:val="28"/>
               </w:rPr>
               <w:t xml:space="preserve"> fluxo alternativo </w:t>
+            </w:r>
+          </w:p>
+        </w:tc>
+      </w:tr>
+      <w:tr>
+        <w:tc>
+          <w:tcPr>
+            <w:tcW w:w="3209" w:type="dxa"/>
+            <w:tcBorders>
+              <w:top w:val="single" w:sz="4" w:space="0" w:color="000000"/>
+              <w:left w:val="single" w:sz="4" w:space="0" w:color="000000"/>
+              <w:bottom w:val="single" w:sz="4" w:space="0" w:color="000000"/>
+              <w:right w:val="single" w:sz="4" w:space="0" w:color="000000"/>
+            </w:tcBorders>
+          </w:tcPr>
+          <w:p>
+            <w:pPr>
+              <w:spacing w:line="360" w:lineRule="auto"/>
+              <w:jc w:val="center"/>
+              <w:rPr>
+                <w:sz w:val="28"/>
+                <w:szCs w:val="28"/>
+              </w:rPr>
+            </w:pPr>
+            <w:r>
+              <w:rPr>
+                <w:sz w:val="28"/>
+                <w:szCs w:val="28"/>
+              </w:rPr>
+              <w:t>23/07/2025</w:t>
+            </w:r>
+          </w:p>
+        </w:tc>
+        <w:tc>
+          <w:tcPr>
+            <w:tcW w:w="3209" w:type="dxa"/>
+            <w:tcBorders>
+              <w:top w:val="single" w:sz="4" w:space="0" w:color="000000"/>
+              <w:left w:val="single" w:sz="4" w:space="0" w:color="000000"/>
+              <w:bottom w:val="single" w:sz="4" w:space="0" w:color="000000"/>
+              <w:right w:val="single" w:sz="4" w:space="0" w:color="000000"/>
+            </w:tcBorders>
+          </w:tcPr>
+          <w:p>
+            <w:pPr>
+              <w:tabs>
+                <w:tab w:val="left" w:pos="449"/>
+              </w:tabs>
+              <w:spacing w:line="360" w:lineRule="auto"/>
+              <w:jc w:val="center"/>
+              <w:rPr>
+                <w:sz w:val="28"/>
+                <w:szCs w:val="28"/>
+              </w:rPr>
+            </w:pPr>
+            <w:r>
+              <w:rPr>
+                <w:sz w:val="28"/>
+                <w:szCs w:val="28"/>
+              </w:rPr>
+              <w:t>Pedro Henrique</w:t>
+            </w:r>
+          </w:p>
+        </w:tc>
+        <w:tc>
+          <w:tcPr>
+            <w:tcW w:w="3210" w:type="dxa"/>
+            <w:tcBorders>
+              <w:top w:val="single" w:sz="4" w:space="0" w:color="000000"/>
+              <w:left w:val="single" w:sz="4" w:space="0" w:color="000000"/>
+              <w:bottom w:val="single" w:sz="4" w:space="0" w:color="000000"/>
+              <w:right w:val="single" w:sz="4" w:space="0" w:color="000000"/>
+            </w:tcBorders>
+          </w:tcPr>
+          <w:p>
+            <w:pPr>
+              <w:spacing w:line="360" w:lineRule="auto"/>
+              <w:jc w:val="center"/>
+              <w:rPr>
+                <w:sz w:val="28"/>
+                <w:szCs w:val="28"/>
+              </w:rPr>
+            </w:pPr>
+            <w:r>
+              <w:rPr>
+                <w:sz w:val="28"/>
+                <w:szCs w:val="28"/>
+              </w:rPr>
+              <w:t>Correção do fluxo principal e seção Incluir pedido</w:t>
             </w:r>
           </w:p>
         </w:tc>
@@ -3303,6 +3369,8 @@
           <w:u w:val="single"/>
         </w:rPr>
       </w:pPr>
+      <w:bookmarkStart w:id="2" w:name="_GoBack"/>
+      <w:bookmarkEnd w:id="2"/>
     </w:p>
     <w:sectPr>
       <w:pgSz w:w="11906" w:h="16838"/>
@@ -3317,7 +3385,7 @@
 </file>
 
 <file path=word/numbering.xml><?xml version="1.0" encoding="utf-8"?>
-<w:numbering xmlns:wpc="http://schemas.microsoft.com/office/word/2010/wordprocessingCanvas" xmlns:cx="http://schemas.microsoft.com/office/drawing/2014/chartex" xmlns:cx1="http://schemas.microsoft.com/office/drawing/2015/9/8/chartex" xmlns:cx2="http://schemas.microsoft.com/office/drawing/2015/10/21/chartex" xmlns:cx3="http://schemas.microsoft.com/office/drawing/2016/5/9/chartex" xmlns:cx4="http://schemas.microsoft.com/office/drawing/2016/5/10/chartex" xmlns:cx5="http://schemas.microsoft.com/office/drawing/2016/5/11/chartex" xmlns:cx6="http://schemas.microsoft.com/office/drawing/2016/5/12/chartex" xmlns:cx7="http://schemas.microsoft.com/office/drawing/2016/5/13/chartex" xmlns:cx8="http://schemas.microsoft.com/office/drawing/2016/5/14/chartex" xmlns:mc="http://schemas.openxmlformats.org/markup-compatibility/2006" xmlns:aink="http://schemas.microsoft.com/office/drawing/2016/ink" xmlns:am3d="http://schemas.microsoft.com/office/drawing/2017/model3d" xmlns:o="urn:schemas-microsoft-com:office:office" xmlns:oel="http://schemas.microsoft.com/office/2019/extlst" xmlns:r="http://schemas.openxmlformats.org/officeDocument/2006/relationships" xmlns:m="http://schemas.openxmlformats.org/officeDocument/2006/math" xmlns:v="urn:schemas-microsoft-com:vml" xmlns:wp14="http://schemas.microsoft.com/office/word/2010/wordprocessingDrawing" xmlns:wp="http://schemas.openxmlformats.org/drawingml/2006/wordprocessingDrawing" xmlns:w10="urn:schemas-microsoft-com:office:word" xmlns:w="http://schemas.openxmlformats.org/wordprocessingml/2006/main" xmlns:w14="http://schemas.microsoft.com/office/word/2010/wordml" xmlns:w15="http://schemas.microsoft.com/office/word/2012/wordml" xmlns:w16cex="http://schemas.microsoft.com/office/word/2018/wordml/cex" xmlns:w16cid="http://schemas.microsoft.com/office/word/2016/wordml/cid" xmlns:w16="http://schemas.microsoft.com/office/word/2018/wordml" xmlns:w16du="http://schemas.microsoft.com/office/word/2023/wordml/word16du" xmlns:w16sdtdh="http://schemas.microsoft.com/office/word/2020/wordml/sdtdatahash" xmlns:w16se="http://schemas.microsoft.com/office/word/2015/wordml/symex" xmlns:wpg="http://schemas.microsoft.com/office/word/2010/wordprocessingGroup" xmlns:wpi="http://schemas.microsoft.com/office/word/2010/wordprocessingInk" xmlns:wne="http://schemas.microsoft.com/office/word/2006/wordml" xmlns:wps="http://schemas.microsoft.com/office/word/2010/wordprocessingShape" mc:Ignorable="w14 w15 w16se w16cid w16 w16cex w16sdtdh w16du wp14">
+<w:numbering xmlns:wpc="http://schemas.microsoft.com/office/word/2010/wordprocessingCanvas" xmlns:cx="http://schemas.microsoft.com/office/drawing/2014/chartex" xmlns:mc="http://schemas.openxmlformats.org/markup-compatibility/2006" xmlns:o="urn:schemas-microsoft-com:office:office" xmlns:r="http://schemas.openxmlformats.org/officeDocument/2006/relationships" xmlns:m="http://schemas.openxmlformats.org/officeDocument/2006/math" xmlns:v="urn:schemas-microsoft-com:vml" xmlns:wp14="http://schemas.microsoft.com/office/word/2010/wordprocessingDrawing" xmlns:wp="http://schemas.openxmlformats.org/drawingml/2006/wordprocessingDrawing" xmlns:w10="urn:schemas-microsoft-com:office:word" xmlns:w="http://schemas.openxmlformats.org/wordprocessingml/2006/main" xmlns:w14="http://schemas.microsoft.com/office/word/2010/wordml" xmlns:w15="http://schemas.microsoft.com/office/word/2012/wordml" xmlns:w16se="http://schemas.microsoft.com/office/word/2015/wordml/symex" xmlns:wpg="http://schemas.microsoft.com/office/word/2010/wordprocessingGroup" xmlns:wpi="http://schemas.microsoft.com/office/word/2010/wordprocessingInk" xmlns:wne="http://schemas.microsoft.com/office/word/2006/wordml" xmlns:wps="http://schemas.microsoft.com/office/word/2010/wordprocessingShape" mc:Ignorable="w14 w15 w16se wp14">
   <w:abstractNum w:abstractNumId="0" w15:restartNumberingAfterBreak="0">
     <w:nsid w:val="41D13E58"/>
     <w:multiLevelType w:val="multilevel"/>
@@ -3581,17 +3649,17 @@
       </w:rPr>
     </w:lvl>
   </w:abstractNum>
-  <w:num w:numId="1" w16cid:durableId="1582719055">
+  <w:num w:numId="1">
     <w:abstractNumId w:val="1"/>
   </w:num>
-  <w:num w:numId="2" w16cid:durableId="1119299579">
+  <w:num w:numId="2">
     <w:abstractNumId w:val="0"/>
   </w:num>
 </w:numbering>
 </file>
 
 <file path=word/styles.xml><?xml version="1.0" encoding="utf-8"?>
-<w:styles xmlns:mc="http://schemas.openxmlformats.org/markup-compatibility/2006" xmlns:r="http://schemas.openxmlformats.org/officeDocument/2006/relationships" xmlns:w="http://schemas.openxmlformats.org/wordprocessingml/2006/main" xmlns:w14="http://schemas.microsoft.com/office/word/2010/wordml" xmlns:w15="http://schemas.microsoft.com/office/word/2012/wordml" xmlns:w16cex="http://schemas.microsoft.com/office/word/2018/wordml/cex" xmlns:w16cid="http://schemas.microsoft.com/office/word/2016/wordml/cid" xmlns:w16="http://schemas.microsoft.com/office/word/2018/wordml" xmlns:w16du="http://schemas.microsoft.com/office/word/2023/wordml/word16du" xmlns:w16sdtdh="http://schemas.microsoft.com/office/word/2020/wordml/sdtdatahash" xmlns:w16se="http://schemas.microsoft.com/office/word/2015/wordml/symex" mc:Ignorable="w14 w15 w16se w16cid w16 w16cex w16sdtdh w16du">
+<w:styles xmlns:mc="http://schemas.openxmlformats.org/markup-compatibility/2006" xmlns:r="http://schemas.openxmlformats.org/officeDocument/2006/relationships" xmlns:w="http://schemas.openxmlformats.org/wordprocessingml/2006/main" xmlns:w14="http://schemas.microsoft.com/office/word/2010/wordml" xmlns:w15="http://schemas.microsoft.com/office/word/2012/wordml" xmlns:w16se="http://schemas.microsoft.com/office/word/2015/wordml/symex" mc:Ignorable="w14 w15 w16se">
   <w:docDefaults>
     <w:rPrDefault>
       <w:rPr>
@@ -3609,7 +3677,7 @@
       </w:pPr>
     </w:pPrDefault>
   </w:docDefaults>
-  <w:latentStyles w:defLockedState="0" w:defUIPriority="99" w:defSemiHidden="0" w:defUnhideWhenUsed="0" w:defQFormat="0" w:count="376">
+  <w:latentStyles w:defLockedState="0" w:defUIPriority="99" w:defSemiHidden="0" w:defUnhideWhenUsed="0" w:defQFormat="0" w:count="371">
     <w:lsdException w:name="Normal" w:uiPriority="0" w:qFormat="1"/>
     <w:lsdException w:name="heading 1" w:uiPriority="9" w:qFormat="1"/>
     <w:lsdException w:name="heading 2" w:semiHidden="1" w:uiPriority="9" w:unhideWhenUsed="1" w:qFormat="1"/>
@@ -3981,11 +4049,6 @@
     <w:lsdException w:name="List Table 5 Dark Accent 6" w:uiPriority="50"/>
     <w:lsdException w:name="List Table 6 Colorful Accent 6" w:uiPriority="51"/>
     <w:lsdException w:name="List Table 7 Colorful Accent 6" w:uiPriority="52"/>
-    <w:lsdException w:name="Mention" w:semiHidden="1" w:unhideWhenUsed="1"/>
-    <w:lsdException w:name="Smart Hyperlink" w:semiHidden="1" w:unhideWhenUsed="1"/>
-    <w:lsdException w:name="Hashtag" w:semiHidden="1" w:unhideWhenUsed="1"/>
-    <w:lsdException w:name="Unresolved Mention" w:semiHidden="1" w:unhideWhenUsed="1"/>
-    <w:lsdException w:name="Smart Link" w:semiHidden="1" w:unhideWhenUsed="1"/>
   </w:latentStyles>
   <w:style w:type="paragraph" w:default="1" w:styleId="Normal">
     <w:name w:val="Normal"/>
@@ -4200,6 +4263,7 @@
   <w:style w:type="character" w:default="1" w:styleId="Fontepargpadro">
     <w:name w:val="Default Paragraph Font"/>
     <w:uiPriority w:val="1"/>
+    <w:semiHidden/>
     <w:unhideWhenUsed/>
   </w:style>
   <w:style w:type="table" w:default="1" w:styleId="Tabelanormal">

</xml_diff>

<commit_message>
Pequenas melhorias e fluxo de exceção no CSU03 - Manter pedido. Close #104
</commit_message>
<xml_diff>
--- a/Requisitos/CSU03 - Manter pedido.docx
+++ b/Requisitos/CSU03 - Manter pedido.docx
@@ -861,14 +861,7 @@
                 <w:sz w:val="28"/>
                 <w:szCs w:val="28"/>
               </w:rPr>
-              <w:t>.</w:t>
-            </w:r>
-            <w:r>
-              <w:rPr>
-                <w:sz w:val="28"/>
-                <w:szCs w:val="28"/>
-              </w:rPr>
-              <w:t xml:space="preserve"> Ator seleciona a cliente e pressiona o ícone correspondente. (</w:t>
+              <w:t>. Ator seleciona a cliente e pressiona o ícone correspondente. (</w:t>
             </w:r>
             <w:r>
               <w:rPr>
@@ -1008,14 +1001,7 @@
                 <w:sz w:val="28"/>
                 <w:szCs w:val="28"/>
               </w:rPr>
-              <w:t>. Ator seleciona o</w:t>
-            </w:r>
-            <w:r>
-              <w:rPr>
-                <w:sz w:val="28"/>
-                <w:szCs w:val="28"/>
-              </w:rPr>
-              <w:t xml:space="preserve"> pedido e pressiona a ícone correspondente. (</w:t>
+              <w:t>. Ator seleciona o pedido e pressiona a ícone correspondente. (</w:t>
             </w:r>
             <w:r>
               <w:rPr>
@@ -1203,14 +1189,7 @@
                 <w:sz w:val="28"/>
                 <w:szCs w:val="28"/>
               </w:rPr>
-              <w:t>. Ator pressio</w:t>
-            </w:r>
-            <w:r>
-              <w:rPr>
-                <w:sz w:val="28"/>
-                <w:szCs w:val="28"/>
-              </w:rPr>
-              <w:t>na botão “</w:t>
+              <w:t>. Ator pressiona botão “</w:t>
             </w:r>
             <w:r>
               <w:rPr>
@@ -1554,14 +1533,7 @@
                 <w:sz w:val="28"/>
                 <w:szCs w:val="28"/>
               </w:rPr>
-              <w:t xml:space="preserve">2. Ator seleciona a mesa e pressiona o ícone </w:t>
-            </w:r>
-            <w:r>
-              <w:rPr>
-                <w:sz w:val="28"/>
-                <w:szCs w:val="28"/>
-              </w:rPr>
-              <w:t>correspondente. (</w:t>
+              <w:t>2. Ator seleciona a mesa e pressiona o ícone correspondente. (</w:t>
             </w:r>
             <w:r>
               <w:rPr>
@@ -1717,14 +1689,7 @@
                 <w:sz w:val="28"/>
                 <w:szCs w:val="28"/>
               </w:rPr>
-              <w:t xml:space="preserve">7. </w:t>
-            </w:r>
-            <w:r>
-              <w:rPr>
-                <w:sz w:val="28"/>
-                <w:szCs w:val="28"/>
-              </w:rPr>
-              <w:t>Sistema exibe tela de status. (</w:t>
+              <w:t>7. Sistema exibe tela de status. (</w:t>
             </w:r>
             <w:r>
               <w:rPr>
@@ -2039,14 +2004,7 @@
                 <w:sz w:val="28"/>
                 <w:szCs w:val="28"/>
               </w:rPr>
-              <w:t xml:space="preserve">1. Sistema exibe </w:t>
-            </w:r>
-            <w:r>
-              <w:rPr>
-                <w:sz w:val="28"/>
-                <w:szCs w:val="28"/>
-              </w:rPr>
-              <w:t>menu de mesa. (</w:t>
+              <w:t>1. Sistema exibe menu de mesa. (</w:t>
             </w:r>
             <w:r>
               <w:rPr>
@@ -2166,15 +2124,7 @@
                 <w:sz w:val="28"/>
                 <w:szCs w:val="28"/>
               </w:rPr>
-              <w:t>Tel</w:t>
-            </w:r>
-            <w:r>
-              <w:rPr>
-                <w:color w:val="FF0000"/>
-                <w:sz w:val="28"/>
-                <w:szCs w:val="28"/>
-              </w:rPr>
-              <w:t>a 05</w:t>
+              <w:t>Tela 05</w:t>
             </w:r>
             <w:r>
               <w:rPr>
@@ -2344,10 +2294,6 @@
             <w:pPr>
               <w:spacing w:line="360" w:lineRule="auto"/>
               <w:jc w:val="both"/>
-              <w:rPr>
-                <w:sz w:val="28"/>
-                <w:szCs w:val="28"/>
-              </w:rPr>
             </w:pPr>
             <w:r>
               <w:rPr>
@@ -2355,7 +2301,7 @@
                 <w:sz w:val="28"/>
                 <w:szCs w:val="28"/>
               </w:rPr>
-              <w:t xml:space="preserve">Passo 7: </w:t>
+              <w:t xml:space="preserve">Passo 5: </w:t>
             </w:r>
             <w:r>
               <w:rPr>
@@ -2371,73 +2317,114 @@
                 <w:sz w:val="28"/>
                 <w:szCs w:val="28"/>
               </w:rPr>
-              <w:t>X</w:t>
-            </w:r>
-            <w:r>
-              <w:rPr>
-                <w:sz w:val="28"/>
-                <w:szCs w:val="28"/>
-              </w:rPr>
-              <w:t>”, o pedido é retirado da lista</w:t>
-            </w:r>
-            <w:r>
-              <w:rPr>
-                <w:sz w:val="28"/>
-                <w:szCs w:val="28"/>
-              </w:rPr>
-              <w:t xml:space="preserve"> de pedidos.</w:t>
-            </w:r>
-          </w:p>
-          <w:p>
-            <w:pPr>
-              <w:spacing w:line="360" w:lineRule="auto"/>
-              <w:jc w:val="both"/>
-            </w:pPr>
-            <w:r>
+              <w:t>Carrinho de Compra</w:t>
+            </w:r>
+            <w:r>
+              <w:rPr>
+                <w:sz w:val="28"/>
+                <w:szCs w:val="28"/>
+              </w:rPr>
+              <w:t>”, sistema exibe (</w:t>
+            </w:r>
+            <w:r>
+              <w:rPr>
+                <w:color w:val="FF0000"/>
+                <w:sz w:val="28"/>
+                <w:szCs w:val="28"/>
+              </w:rPr>
+              <w:t>Tela 07</w:t>
+            </w:r>
+            <w:r>
+              <w:rPr>
+                <w:sz w:val="28"/>
+                <w:szCs w:val="28"/>
+              </w:rPr>
+              <w:t>).</w:t>
+            </w:r>
+          </w:p>
+        </w:tc>
+      </w:tr>
+      <w:tr>
+        <w:tc>
+          <w:tcPr>
+            <w:tcW w:w="9628" w:type="dxa"/>
+            <w:tcBorders>
+              <w:top w:val="single" w:sz="4" w:space="0" w:color="000000"/>
+              <w:left w:val="single" w:sz="4" w:space="0" w:color="000000"/>
+              <w:bottom w:val="single" w:sz="4" w:space="0" w:color="000000"/>
+              <w:right w:val="single" w:sz="4" w:space="0" w:color="000000"/>
+            </w:tcBorders>
+          </w:tcPr>
+          <w:p>
+            <w:pPr>
+              <w:spacing w:line="360" w:lineRule="auto"/>
+              <w:jc w:val="center"/>
               <w:rPr>
                 <w:b/>
                 <w:sz w:val="28"/>
                 <w:szCs w:val="28"/>
               </w:rPr>
-              <w:t xml:space="preserve">Passo 5: </w:t>
-            </w:r>
-            <w:r>
-              <w:rPr>
-                <w:sz w:val="28"/>
-                <w:szCs w:val="28"/>
-              </w:rPr>
-              <w:t>Caso o ator pressione o ícone “</w:t>
-            </w:r>
+            </w:pPr>
             <w:r>
               <w:rPr>
                 <w:b/>
-                <w:bCs/>
-                <w:sz w:val="28"/>
-                <w:szCs w:val="28"/>
-              </w:rPr>
-              <w:t>Carrinho de Compra</w:t>
-            </w:r>
-            <w:r>
-              <w:rPr>
-                <w:sz w:val="28"/>
-                <w:szCs w:val="28"/>
-              </w:rPr>
-              <w:t>”, sistema exibe (</w:t>
-            </w:r>
-            <w:r>
-              <w:rPr>
-                <w:color w:val="FF0000"/>
-                <w:sz w:val="28"/>
-                <w:szCs w:val="28"/>
-              </w:rPr>
-              <w:t>Tela 07</w:t>
-            </w:r>
-            <w:r>
-              <w:rPr>
-                <w:sz w:val="28"/>
-                <w:szCs w:val="28"/>
-              </w:rPr>
-              <w:t>).</w:t>
+                <w:sz w:val="28"/>
+                <w:szCs w:val="28"/>
+              </w:rPr>
+              <w:t>F</w:t>
+            </w:r>
+            <w:r>
+              <w:rPr>
+                <w:b/>
+                <w:sz w:val="28"/>
+                <w:szCs w:val="28"/>
+              </w:rPr>
+              <w:t>luxo</w:t>
+            </w:r>
+            <w:r>
+              <w:rPr>
+                <w:b/>
+                <w:sz w:val="28"/>
+                <w:szCs w:val="28"/>
+              </w:rPr>
+              <w:t xml:space="preserve"> de Exceção</w:t>
+            </w:r>
+          </w:p>
+        </w:tc>
+      </w:tr>
+      <w:tr>
+        <w:tc>
+          <w:tcPr>
+            <w:tcW w:w="9628" w:type="dxa"/>
+            <w:tcBorders>
+              <w:top w:val="single" w:sz="4" w:space="0" w:color="000000"/>
+              <w:left w:val="single" w:sz="4" w:space="0" w:color="000000"/>
+              <w:bottom w:val="single" w:sz="4" w:space="0" w:color="000000"/>
+              <w:right w:val="single" w:sz="4" w:space="0" w:color="000000"/>
+            </w:tcBorders>
+          </w:tcPr>
+          <w:p>
+            <w:pPr>
+              <w:spacing w:line="360" w:lineRule="auto"/>
+              <w:rPr>
+                <w:sz w:val="28"/>
+                <w:szCs w:val="28"/>
+              </w:rPr>
+            </w:pPr>
+            <w:r>
+              <w:rPr>
+                <w:b/>
+                <w:sz w:val="28"/>
+                <w:szCs w:val="28"/>
+              </w:rPr>
+              <w:t xml:space="preserve">Passo 8: </w:t>
+            </w:r>
+            <w:r>
+              <w:rPr>
+                <w:sz w:val="28"/>
+                <w:szCs w:val="28"/>
+              </w:rPr>
+              <w:t>Produção do pedido iniciada. Mostrar aviso ao ator: “Produção já foi iniciada. Não é possível editar o pedido.”</w:t>
             </w:r>
           </w:p>
         </w:tc>
@@ -2572,6 +2559,7 @@
                 <w:sz w:val="28"/>
                 <w:szCs w:val="28"/>
               </w:rPr>
+              <w:lastRenderedPageBreak/>
               <w:t>Fluxo Principal</w:t>
             </w:r>
           </w:p>
@@ -2626,15 +2614,7 @@
                 <w:sz w:val="28"/>
                 <w:szCs w:val="28"/>
               </w:rPr>
-              <w:lastRenderedPageBreak/>
-              <w:t xml:space="preserve">2. Ator seleciona a mesa e pressiona o ícone </w:t>
-            </w:r>
-            <w:r>
-              <w:rPr>
-                <w:sz w:val="28"/>
-                <w:szCs w:val="28"/>
-              </w:rPr>
-              <w:t>correspondente. (</w:t>
+              <w:t>2. Ator seleciona a mesa e pressiona o ícone correspondente. (</w:t>
             </w:r>
             <w:r>
               <w:rPr>
@@ -2790,14 +2770,7 @@
                 <w:sz w:val="28"/>
                 <w:szCs w:val="28"/>
               </w:rPr>
-              <w:t>7. Sistema exibe</w:t>
-            </w:r>
-            <w:r>
-              <w:rPr>
-                <w:sz w:val="28"/>
-                <w:szCs w:val="28"/>
-              </w:rPr>
-              <w:t xml:space="preserve"> tela de status. (</w:t>
+              <w:t>7. Sistema exibe tela de status. (</w:t>
             </w:r>
             <w:r>
               <w:rPr>
@@ -2833,14 +2806,42 @@
                 <w:sz w:val="28"/>
                 <w:szCs w:val="28"/>
               </w:rPr>
-              <w:t>caneta</w:t>
-            </w:r>
-            <w:r>
-              <w:rPr>
-                <w:sz w:val="28"/>
-                <w:szCs w:val="28"/>
-              </w:rPr>
-              <w:t>”. (</w:t>
+              <w:t>X</w:t>
+            </w:r>
+            <w:r>
+              <w:rPr>
+                <w:sz w:val="28"/>
+                <w:szCs w:val="28"/>
+              </w:rPr>
+              <w:t>”.</w:t>
+            </w:r>
+            <w:r>
+              <w:rPr>
+                <w:sz w:val="28"/>
+                <w:szCs w:val="28"/>
+              </w:rPr>
+              <w:t xml:space="preserve"> </w:t>
+            </w:r>
+            <w:r>
+              <w:rPr>
+                <w:sz w:val="28"/>
+                <w:szCs w:val="28"/>
+              </w:rPr>
+              <w:t>I</w:t>
+            </w:r>
+            <w:r>
+              <w:rPr>
+                <w:sz w:val="28"/>
+                <w:szCs w:val="28"/>
+              </w:rPr>
+              <w:t>rá aparecer um pop-up perguntando: “Deseja remover o item?”, com as opções sim ou não.</w:t>
+            </w:r>
+            <w:r>
+              <w:rPr>
+                <w:sz w:val="28"/>
+                <w:szCs w:val="28"/>
+              </w:rPr>
+              <w:t xml:space="preserve"> (</w:t>
             </w:r>
             <w:r>
               <w:rPr>
@@ -2886,7 +2887,6 @@
                 <w:sz w:val="28"/>
                 <w:szCs w:val="28"/>
               </w:rPr>
-              <w:lastRenderedPageBreak/>
               <w:t>Fluxo alternativo</w:t>
             </w:r>
           </w:p>
@@ -2964,6 +2964,106 @@
                 <w:szCs w:val="28"/>
               </w:rPr>
               <w:t>)</w:t>
+            </w:r>
+          </w:p>
+        </w:tc>
+      </w:tr>
+      <w:tr>
+        <w:tc>
+          <w:tcPr>
+            <w:tcW w:w="9628" w:type="dxa"/>
+            <w:tcBorders>
+              <w:top w:val="single" w:sz="4" w:space="0" w:color="000000"/>
+              <w:left w:val="single" w:sz="4" w:space="0" w:color="000000"/>
+              <w:bottom w:val="single" w:sz="4" w:space="0" w:color="000000"/>
+              <w:right w:val="single" w:sz="4" w:space="0" w:color="000000"/>
+            </w:tcBorders>
+          </w:tcPr>
+          <w:p>
+            <w:pPr>
+              <w:spacing w:line="360" w:lineRule="auto"/>
+              <w:jc w:val="center"/>
+              <w:rPr>
+                <w:b/>
+                <w:sz w:val="28"/>
+                <w:szCs w:val="28"/>
+              </w:rPr>
+            </w:pPr>
+            <w:r>
+              <w:rPr>
+                <w:b/>
+                <w:sz w:val="28"/>
+                <w:szCs w:val="28"/>
+              </w:rPr>
+              <w:t>F</w:t>
+            </w:r>
+            <w:r>
+              <w:rPr>
+                <w:b/>
+                <w:sz w:val="28"/>
+                <w:szCs w:val="28"/>
+              </w:rPr>
+              <w:t>luxo</w:t>
+            </w:r>
+            <w:r>
+              <w:rPr>
+                <w:b/>
+                <w:sz w:val="28"/>
+                <w:szCs w:val="28"/>
+              </w:rPr>
+              <w:t xml:space="preserve"> de Exceção</w:t>
+            </w:r>
+          </w:p>
+        </w:tc>
+      </w:tr>
+      <w:tr>
+        <w:tc>
+          <w:tcPr>
+            <w:tcW w:w="9628" w:type="dxa"/>
+            <w:tcBorders>
+              <w:top w:val="single" w:sz="4" w:space="0" w:color="000000"/>
+              <w:left w:val="single" w:sz="4" w:space="0" w:color="000000"/>
+              <w:bottom w:val="single" w:sz="4" w:space="0" w:color="000000"/>
+              <w:right w:val="single" w:sz="4" w:space="0" w:color="000000"/>
+            </w:tcBorders>
+          </w:tcPr>
+          <w:p>
+            <w:pPr>
+              <w:spacing w:line="360" w:lineRule="auto"/>
+              <w:rPr>
+                <w:b/>
+                <w:sz w:val="28"/>
+                <w:szCs w:val="28"/>
+              </w:rPr>
+            </w:pPr>
+            <w:r>
+              <w:rPr>
+                <w:b/>
+                <w:sz w:val="28"/>
+                <w:szCs w:val="28"/>
+              </w:rPr>
+              <w:t xml:space="preserve">Passo 8: </w:t>
+            </w:r>
+            <w:r>
+              <w:rPr>
+                <w:sz w:val="28"/>
+                <w:szCs w:val="28"/>
+              </w:rPr>
+              <w:t xml:space="preserve">Produção do pedido iniciada. Mostrar aviso ao ator: “Produção já foi iniciada. Não é possível </w:t>
+            </w:r>
+            <w:r>
+              <w:rPr>
+                <w:sz w:val="28"/>
+                <w:szCs w:val="28"/>
+              </w:rPr>
+              <w:t>remover</w:t>
+            </w:r>
+            <w:r>
+              <w:rPr>
+                <w:sz w:val="28"/>
+                <w:szCs w:val="28"/>
+              </w:rPr>
+              <w:t xml:space="preserve"> o pedido.”</w:t>
             </w:r>
           </w:p>
         </w:tc>
@@ -3122,14 +3222,7 @@
                 <w:sz w:val="28"/>
                 <w:szCs w:val="28"/>
               </w:rPr>
-              <w:t>Talysson</w:t>
-            </w:r>
-            <w:r>
-              <w:rPr>
-                <w:sz w:val="28"/>
-                <w:szCs w:val="28"/>
-              </w:rPr>
-              <w:t xml:space="preserve"> Vasconcelos</w:t>
+              <w:t>Talysson Vasconcelos</w:t>
             </w:r>
           </w:p>
         </w:tc>
@@ -3209,21 +3302,12 @@
                 <w:szCs w:val="28"/>
               </w:rPr>
             </w:pPr>
-            <w:proofErr w:type="spellStart"/>
-            <w:r>
-              <w:rPr>
-                <w:sz w:val="28"/>
-                <w:szCs w:val="28"/>
-              </w:rPr>
-              <w:t>Rennê</w:t>
-            </w:r>
-            <w:proofErr w:type="spellEnd"/>
-            <w:r>
-              <w:rPr>
-                <w:sz w:val="28"/>
-                <w:szCs w:val="28"/>
-              </w:rPr>
-              <w:t xml:space="preserve"> Bispo</w:t>
+            <w:r>
+              <w:rPr>
+                <w:sz w:val="28"/>
+                <w:szCs w:val="28"/>
+              </w:rPr>
+              <w:t>Rennê Bispo</w:t>
             </w:r>
           </w:p>
         </w:tc>
@@ -3264,6 +3348,9 @@
         </w:tc>
       </w:tr>
       <w:tr>
+        <w:trPr>
+          <w:trHeight w:val="1826"/>
+        </w:trPr>
         <w:tc>
           <w:tcPr>
             <w:tcW w:w="3209" w:type="dxa"/>
@@ -3348,6 +3435,119 @@
                 <w:szCs w:val="28"/>
               </w:rPr>
               <w:t>Correção do fluxo principal e seção Incluir pedido</w:t>
+            </w:r>
+          </w:p>
+        </w:tc>
+      </w:tr>
+      <w:tr>
+        <w:tc>
+          <w:tcPr>
+            <w:tcW w:w="3209" w:type="dxa"/>
+            <w:tcBorders>
+              <w:top w:val="single" w:sz="4" w:space="0" w:color="000000"/>
+              <w:left w:val="single" w:sz="4" w:space="0" w:color="000000"/>
+              <w:bottom w:val="single" w:sz="4" w:space="0" w:color="000000"/>
+              <w:right w:val="single" w:sz="4" w:space="0" w:color="000000"/>
+            </w:tcBorders>
+          </w:tcPr>
+          <w:p>
+            <w:pPr>
+              <w:spacing w:line="360" w:lineRule="auto"/>
+              <w:jc w:val="center"/>
+              <w:rPr>
+                <w:sz w:val="28"/>
+                <w:szCs w:val="28"/>
+              </w:rPr>
+            </w:pPr>
+            <w:r>
+              <w:rPr>
+                <w:sz w:val="28"/>
+                <w:szCs w:val="28"/>
+              </w:rPr>
+              <w:lastRenderedPageBreak/>
+              <w:t>02/08</w:t>
+            </w:r>
+            <w:r>
+              <w:rPr>
+                <w:sz w:val="28"/>
+                <w:szCs w:val="28"/>
+              </w:rPr>
+              <w:t>/2025</w:t>
+            </w:r>
+          </w:p>
+        </w:tc>
+        <w:tc>
+          <w:tcPr>
+            <w:tcW w:w="3209" w:type="dxa"/>
+            <w:tcBorders>
+              <w:top w:val="single" w:sz="4" w:space="0" w:color="000000"/>
+              <w:left w:val="single" w:sz="4" w:space="0" w:color="000000"/>
+              <w:bottom w:val="single" w:sz="4" w:space="0" w:color="000000"/>
+              <w:right w:val="single" w:sz="4" w:space="0" w:color="000000"/>
+            </w:tcBorders>
+          </w:tcPr>
+          <w:p>
+            <w:pPr>
+              <w:tabs>
+                <w:tab w:val="left" w:pos="449"/>
+              </w:tabs>
+              <w:spacing w:line="360" w:lineRule="auto"/>
+              <w:jc w:val="center"/>
+              <w:rPr>
+                <w:sz w:val="28"/>
+                <w:szCs w:val="28"/>
+              </w:rPr>
+            </w:pPr>
+            <w:r>
+              <w:rPr>
+                <w:sz w:val="28"/>
+                <w:szCs w:val="28"/>
+              </w:rPr>
+              <w:t>Pedro Henrique</w:t>
+            </w:r>
+          </w:p>
+        </w:tc>
+        <w:tc>
+          <w:tcPr>
+            <w:tcW w:w="3210" w:type="dxa"/>
+            <w:tcBorders>
+              <w:top w:val="single" w:sz="4" w:space="0" w:color="000000"/>
+              <w:left w:val="single" w:sz="4" w:space="0" w:color="000000"/>
+              <w:bottom w:val="single" w:sz="4" w:space="0" w:color="000000"/>
+              <w:right w:val="single" w:sz="4" w:space="0" w:color="000000"/>
+            </w:tcBorders>
+          </w:tcPr>
+          <w:p>
+            <w:pPr>
+              <w:spacing w:line="360" w:lineRule="auto"/>
+              <w:jc w:val="center"/>
+              <w:rPr>
+                <w:sz w:val="28"/>
+                <w:szCs w:val="28"/>
+              </w:rPr>
+            </w:pPr>
+            <w:r>
+              <w:rPr>
+                <w:sz w:val="28"/>
+                <w:szCs w:val="28"/>
+              </w:rPr>
+              <w:t>Adicionado</w:t>
+            </w:r>
+            <w:r>
+              <w:rPr>
+                <w:sz w:val="28"/>
+                <w:szCs w:val="28"/>
+              </w:rPr>
+              <w:t xml:space="preserve"> os</w:t>
+            </w:r>
+            <w:bookmarkStart w:id="2" w:name="_GoBack"/>
+            <w:bookmarkEnd w:id="2"/>
+            <w:r>
+              <w:rPr>
+                <w:sz w:val="28"/>
+                <w:szCs w:val="28"/>
+              </w:rPr>
+              <w:t xml:space="preserve"> fluxos de exceção e pequenas melhorias</w:t>
             </w:r>
           </w:p>
         </w:tc>
@@ -3369,8 +3569,6 @@
           <w:u w:val="single"/>
         </w:rPr>
       </w:pPr>
-      <w:bookmarkStart w:id="2" w:name="_GoBack"/>
-      <w:bookmarkEnd w:id="2"/>
     </w:p>
     <w:sectPr>
       <w:pgSz w:w="11906" w:h="16838"/>

</xml_diff>